<commit_message>
feat: sample document reachable from the upload page, with reviewed alt text
The upload page now offers "Explore a sample document". The demo data was
recaptured with Ollama qwen2.5vl:3b available: both figures got AI alt text,
which was checked against the figures and approved, Figure 1 with a
reviewer edit because the draft misread the chart. The offline notice is
hidden on the sample page, which needs no server.

Co-Authored-By: Claude Opus 5.5 <noreply@anthropic.com>
</commit_message>
<xml_diff>
--- a/frontend/public/demo/download/document.docx
+++ b/frontend/public/demo/download/document.docx
@@ -71,7 +71,7 @@
               <a:graphicData uri="http://schemas.openxmlformats.org/drawingml/2006/picture">
                 <pic:pic>
                   <pic:nvPicPr>
-                    <pic:cNvPr id="0" name="page1_img2_205b090c535f470698a28a7a12688698.png"/>
+                    <pic:cNvPr id="0" name="page1_img2_d21687758d7541b5979ee2146043c58a.png"/>
                     <pic:cNvPicPr/>
                   </pic:nvPicPr>
                   <pic:blipFill>
@@ -891,7 +891,7 @@
         <w:drawing>
           <wp:inline xmlns:a="http://schemas.openxmlformats.org/drawingml/2006/main" xmlns:pic="http://schemas.openxmlformats.org/drawingml/2006/picture">
             <wp:extent cx="2596654" cy="1023835"/>
-            <wp:docPr id="3" name="Picture 3" descr="Figure 1. State-wise differences in LCE pedagogy and belief scores.: description pending human review" title="Figure 1. State-wise differences in LCE pedagogy and belief scores.: description pending human review"/>
+            <wp:docPr id="3" name="Picture 3" descr="Two bar charts showing how many teachers in Bihar, Maharashtra and Kerala scored low, medium or high. LCE pedagogy scores: Bihar 12 low, 7 medium, 1 high; Maharashtra 8 low, 9 medium, 3 high; Kerala 0 low, 4 medium, 16 high. LCE belief scores: Bihar 9 low, 9 medium, 2 high; Maharashtra 5 low, 13 medium, 2 high; Kerala 0 low, 2 medium, 18 high. Most Kerala teachers scored high on both, while most Bihar and Maharashtra teachers scored low to medium." title="Two bar charts showing how many teachers in Bihar, Maharashtra and Kerala scored low, medium or high. LCE pedagogy scores: Bihar 12 low, 7 medium, 1 high; Maharashtra 8 low, 9 medium, 3 high; Kerala 0 low, 4 medium, 16 high. LCE belief scores: Bihar 9 low, 9 medium, 2 high; Maharashtra 5 low, 13 medium, 2 high; Kerala 0 low, 2 medium, 18 high. Most Kerala teachers scored high on both, while most Bihar and Maharashtra teachers scored low to medium."/>
             <wp:cNvGraphicFramePr>
               <a:graphicFrameLocks noChangeAspect="1"/>
             </wp:cNvGraphicFramePr>
@@ -5614,7 +5614,7 @@
         <w:drawing>
           <wp:inline xmlns:a="http://schemas.openxmlformats.org/drawingml/2006/main" xmlns:pic="http://schemas.openxmlformats.org/drawingml/2006/picture">
             <wp:extent cx="4278985" cy="2844724"/>
-            <wp:docPr id="4" name="Picture 4" descr="Figure 2. Factors shaping teachers’ beliefs.: description pending human review" title="Figure 2. Factors shaping teachers’ beliefs.: description pending human review"/>
+            <wp:docPr id="4" name="Picture 4" descr="Diagram of four factors shaping teachers' beliefs, each linked by arrows to a central oval, Teacher beliefs, which has a two-way link to Teaching Practice. 1. Socio-cultural context: religious worldviews and ideologies (e.g. caste); societal norms and expectations. 2. Personal experiences: formal (schooling, training) and informal. 3. Educational context: school environment; systemic issues. 4. Teacher as professional: identity, knowledge, skills. The factors are also linked to one another, and educational context and teacher as professional connect directly to Teaching Practice." title="Diagram of four factors shaping teachers' beliefs, each linked by arrows to a central oval, Teacher beliefs, which has a two-way link to Teaching Practice. 1. Socio-cultural context: religious worldviews and ideologies (e.g. caste); societal norms and expectations. 2. Personal experiences: formal (schooling, training) and informal. 3. Educational context: school environment; systemic issues. 4. Teacher as professional: identity, knowledge, skills. The factors are also linked to one another, and educational context and teacher as professional connect directly to Teaching Practice."/>
             <wp:cNvGraphicFramePr>
               <a:graphicFrameLocks noChangeAspect="1"/>
             </wp:cNvGraphicFramePr>

</xml_diff>